<commit_message>
Patch v1 template to use {ChairmanGEC}/{MembersGEC} placeholders + multi-line \n→<w:br/> post-processor
Co-Authored-By: Devin AI <158243242+devin-ai-integration[bot]@users.noreply.github.com>
</commit_message>
<xml_diff>
--- a/Form2Act-master/data/протоколШАБЛОн.docx
+++ b/Form2Act-master/data/протоколШАБЛОн.docx
@@ -737,7 +737,7 @@
           <w:sz w:val="24"/>
           <w:szCs w:val="24"/>
         </w:rPr>
-        <w:t>Алха</w:t>
+        <w:t>{ПредседательГЭК}</w:t>
       </w:r>
       <w:r>
         <w:rPr>
@@ -745,7 +745,6 @@
           <w:sz w:val="24"/>
           <w:szCs w:val="24"/>
         </w:rPr>
-        <w:t>с</w:t>
       </w:r>
       <w:r>
         <w:rPr>
@@ -753,7 +752,6 @@
           <w:sz w:val="24"/>
           <w:szCs w:val="24"/>
         </w:rPr>
-        <w:t>ова</w:t>
       </w:r>
       <w:proofErr w:type="spellEnd"/>
       <w:r>
@@ -762,21 +760,18 @@
           <w:sz w:val="24"/>
           <w:szCs w:val="24"/>
         </w:rPr>
-        <w:t xml:space="preserve"> Р.З.</w:t>
-      </w:r>
-      <w:r>
-        <w:rPr>
-          <w:sz w:val="24"/>
-          <w:szCs w:val="24"/>
-        </w:rPr>
-        <w:t xml:space="preserve">, </w:t>
-      </w:r>
-      <w:r>
-        <w:rPr>
-          <w:sz w:val="24"/>
-          <w:szCs w:val="24"/>
-        </w:rPr>
-        <w:t>заместитель директора проектного центра «Детский Технопарк РГСУ»</w:t>
+      </w:r>
+      <w:r>
+        <w:rPr>
+          <w:sz w:val="24"/>
+          <w:szCs w:val="24"/>
+        </w:rPr>
+      </w:r>
+      <w:r>
+        <w:rPr>
+          <w:sz w:val="24"/>
+          <w:szCs w:val="24"/>
+        </w:rPr>
       </w:r>
     </w:p>
     <w:p>
@@ -816,35 +811,31 @@
           <w:sz w:val="24"/>
           <w:szCs w:val="24"/>
         </w:rPr>
-        <w:t>Дерюгина Т.О.</w:t>
-      </w:r>
-      <w:r>
-        <w:rPr>
-          <w:sz w:val="24"/>
-          <w:szCs w:val="24"/>
-        </w:rPr>
-        <w:t xml:space="preserve">, </w:t>
-      </w:r>
-      <w:r>
-        <w:rPr>
-          <w:sz w:val="24"/>
-          <w:szCs w:val="24"/>
-        </w:rPr>
-        <w:t>заведующий учебной частью</w:t>
-      </w:r>
-      <w:r>
-        <w:rPr>
-          <w:sz w:val="24"/>
-          <w:szCs w:val="24"/>
-        </w:rPr>
-        <w:t xml:space="preserve"> </w:t>
-      </w:r>
-      <w:r>
-        <w:rPr>
-          <w:sz w:val="24"/>
-          <w:szCs w:val="24"/>
-        </w:rPr>
-        <w:t>ГБПОУ «1-й МОК»</w:t>
+        <w:t>{ЗамПредседателяГЭК}</w:t>
+      </w:r>
+      <w:r>
+        <w:rPr>
+          <w:sz w:val="24"/>
+          <w:szCs w:val="24"/>
+        </w:rPr>
+      </w:r>
+      <w:r>
+        <w:rPr>
+          <w:sz w:val="24"/>
+          <w:szCs w:val="24"/>
+        </w:rPr>
+      </w:r>
+      <w:r>
+        <w:rPr>
+          <w:sz w:val="24"/>
+          <w:szCs w:val="24"/>
+        </w:rPr>
+      </w:r>
+      <w:r>
+        <w:rPr>
+          <w:sz w:val="24"/>
+          <w:szCs w:val="24"/>
+        </w:rPr>
       </w:r>
     </w:p>
     <w:p>
@@ -889,559 +880,7 @@
           <w:szCs w:val="24"/>
           <w:shd w:val="clear" w:color="auto" w:fill="FFFFFF"/>
         </w:rPr>
-        <w:t>Гусева А.В. – председатель ПЦК «Информационные системы»,</w:t>
-      </w:r>
-    </w:p>
-    <w:p>
-      <w:pPr>
-        <w:rPr>
-          <w:sz w:val="24"/>
-          <w:szCs w:val="24"/>
-          <w:shd w:val="clear" w:color="auto" w:fill="FFFFFF"/>
-        </w:rPr>
-      </w:pPr>
-      <w:proofErr w:type="spellStart"/>
-      <w:r>
-        <w:rPr>
-          <w:sz w:val="24"/>
-          <w:szCs w:val="24"/>
-          <w:shd w:val="clear" w:color="auto" w:fill="FFFFFF"/>
-        </w:rPr>
-        <w:t>Хрущенко</w:t>
-      </w:r>
-      <w:proofErr w:type="spellEnd"/>
-      <w:r>
-        <w:rPr>
-          <w:sz w:val="24"/>
-          <w:szCs w:val="24"/>
-          <w:shd w:val="clear" w:color="auto" w:fill="FFFFFF"/>
-        </w:rPr>
-        <w:t xml:space="preserve"> А.С</w:t>
-      </w:r>
-      <w:r>
-        <w:rPr>
-          <w:sz w:val="24"/>
-          <w:szCs w:val="24"/>
-          <w:shd w:val="clear" w:color="auto" w:fill="FFFFFF"/>
-        </w:rPr>
-        <w:t>.</w:t>
-      </w:r>
-      <w:r>
-        <w:rPr>
-          <w:sz w:val="24"/>
-          <w:szCs w:val="24"/>
-          <w:shd w:val="clear" w:color="auto" w:fill="FFFFFF"/>
-        </w:rPr>
-        <w:t xml:space="preserve"> - преподаватель ГБПОУ «1-й МОК»,</w:t>
-      </w:r>
-    </w:p>
-    <w:p>
-      <w:pPr>
-        <w:rPr>
-          <w:sz w:val="24"/>
-          <w:szCs w:val="24"/>
-          <w:shd w:val="clear" w:color="auto" w:fill="FFFFFF"/>
-        </w:rPr>
-      </w:pPr>
-      <w:proofErr w:type="spellStart"/>
-      <w:r>
-        <w:rPr>
-          <w:sz w:val="24"/>
-          <w:szCs w:val="24"/>
-          <w:shd w:val="clear" w:color="auto" w:fill="FFFFFF"/>
-        </w:rPr>
-        <w:t>Тузовский</w:t>
-      </w:r>
-      <w:proofErr w:type="spellEnd"/>
-      <w:r>
-        <w:rPr>
-          <w:sz w:val="24"/>
-          <w:szCs w:val="24"/>
-          <w:shd w:val="clear" w:color="auto" w:fill="FFFFFF"/>
-        </w:rPr>
-        <w:t xml:space="preserve"> А.Ф. - преподаватель ГБПОУ «1-й МОК»,</w:t>
-      </w:r>
-    </w:p>
-    <w:p>
-      <w:pPr>
-        <w:rPr>
-          <w:sz w:val="24"/>
-          <w:szCs w:val="24"/>
-          <w:shd w:val="clear" w:color="auto" w:fill="FFFFFF"/>
-        </w:rPr>
-      </w:pPr>
-      <w:r>
-        <w:rPr>
-          <w:sz w:val="24"/>
-          <w:szCs w:val="24"/>
-          <w:shd w:val="clear" w:color="auto" w:fill="FFFFFF"/>
-        </w:rPr>
-        <w:t>Зайцева А.А</w:t>
-      </w:r>
-      <w:r>
-        <w:rPr>
-          <w:sz w:val="24"/>
-          <w:szCs w:val="24"/>
-          <w:shd w:val="clear" w:color="auto" w:fill="FFFFFF"/>
-        </w:rPr>
-        <w:t>.</w:t>
-      </w:r>
-      <w:r>
-        <w:rPr>
-          <w:sz w:val="24"/>
-          <w:szCs w:val="24"/>
-          <w:shd w:val="clear" w:color="auto" w:fill="FFFFFF"/>
-        </w:rPr>
-        <w:t xml:space="preserve"> - преподаватель ГБПОУ «1-й МОК»,</w:t>
-      </w:r>
-    </w:p>
-    <w:p>
-      <w:pPr>
-        <w:rPr>
-          <w:sz w:val="24"/>
-          <w:szCs w:val="24"/>
-          <w:shd w:val="clear" w:color="auto" w:fill="FFFFFF"/>
-        </w:rPr>
-      </w:pPr>
-      <w:proofErr w:type="spellStart"/>
-      <w:r>
-        <w:rPr>
-          <w:sz w:val="24"/>
-          <w:szCs w:val="24"/>
-          <w:shd w:val="clear" w:color="auto" w:fill="FFFFFF"/>
-        </w:rPr>
-        <w:t>Гневашев</w:t>
-      </w:r>
-      <w:proofErr w:type="spellEnd"/>
-      <w:r>
-        <w:rPr>
-          <w:sz w:val="24"/>
-          <w:szCs w:val="24"/>
-          <w:shd w:val="clear" w:color="auto" w:fill="FFFFFF"/>
-        </w:rPr>
-        <w:t xml:space="preserve"> И.В</w:t>
-      </w:r>
-      <w:r>
-        <w:rPr>
-          <w:sz w:val="24"/>
-          <w:szCs w:val="24"/>
-          <w:shd w:val="clear" w:color="auto" w:fill="FFFFFF"/>
-        </w:rPr>
-        <w:t>.</w:t>
-      </w:r>
-      <w:r>
-        <w:rPr>
-          <w:sz w:val="24"/>
-          <w:szCs w:val="24"/>
-          <w:shd w:val="clear" w:color="auto" w:fill="FFFFFF"/>
-        </w:rPr>
-        <w:t xml:space="preserve"> - преподаватель ГБПОУ «1-й МОК»,</w:t>
-      </w:r>
-    </w:p>
-    <w:p>
-      <w:pPr>
-        <w:rPr>
-          <w:sz w:val="24"/>
-          <w:szCs w:val="24"/>
-          <w:shd w:val="clear" w:color="auto" w:fill="FFFFFF"/>
-        </w:rPr>
-      </w:pPr>
-      <w:proofErr w:type="spellStart"/>
-      <w:r>
-        <w:rPr>
-          <w:sz w:val="24"/>
-          <w:szCs w:val="24"/>
-          <w:shd w:val="clear" w:color="auto" w:fill="FFFFFF"/>
-        </w:rPr>
-        <w:t>Паокин</w:t>
-      </w:r>
-      <w:proofErr w:type="spellEnd"/>
-      <w:r>
-        <w:rPr>
-          <w:sz w:val="24"/>
-          <w:szCs w:val="24"/>
-          <w:shd w:val="clear" w:color="auto" w:fill="FFFFFF"/>
-        </w:rPr>
-        <w:t xml:space="preserve"> А.И</w:t>
-      </w:r>
-      <w:r>
-        <w:rPr>
-          <w:sz w:val="24"/>
-          <w:szCs w:val="24"/>
-          <w:shd w:val="clear" w:color="auto" w:fill="FFFFFF"/>
-        </w:rPr>
-        <w:t>.</w:t>
-      </w:r>
-      <w:r>
-        <w:rPr>
-          <w:sz w:val="24"/>
-          <w:szCs w:val="24"/>
-          <w:shd w:val="clear" w:color="auto" w:fill="FFFFFF"/>
-        </w:rPr>
-        <w:t xml:space="preserve"> - преподаватель ГБПОУ «1-й МОК»,</w:t>
-      </w:r>
-    </w:p>
-    <w:p>
-      <w:pPr>
-        <w:rPr>
-          <w:sz w:val="24"/>
-          <w:szCs w:val="24"/>
-          <w:shd w:val="clear" w:color="auto" w:fill="FFFFFF"/>
-        </w:rPr>
-      </w:pPr>
-      <w:proofErr w:type="spellStart"/>
-      <w:r>
-        <w:rPr>
-          <w:sz w:val="24"/>
-          <w:szCs w:val="24"/>
-          <w:shd w:val="clear" w:color="auto" w:fill="FFFFFF"/>
-        </w:rPr>
-        <w:t>Вейнгерова</w:t>
-      </w:r>
-      <w:proofErr w:type="spellEnd"/>
-      <w:r>
-        <w:rPr>
-          <w:sz w:val="24"/>
-          <w:szCs w:val="24"/>
-          <w:shd w:val="clear" w:color="auto" w:fill="FFFFFF"/>
-        </w:rPr>
-        <w:t xml:space="preserve"> </w:t>
-      </w:r>
-      <w:r>
-        <w:rPr>
-          <w:sz w:val="24"/>
-          <w:szCs w:val="24"/>
-          <w:shd w:val="clear" w:color="auto" w:fill="FFFFFF"/>
-        </w:rPr>
-        <w:t>Е.Д.</w:t>
-      </w:r>
-      <w:r>
-        <w:rPr>
-          <w:sz w:val="24"/>
-          <w:szCs w:val="24"/>
-          <w:shd w:val="clear" w:color="auto" w:fill="FFFFFF"/>
-        </w:rPr>
-        <w:t xml:space="preserve"> - </w:t>
-      </w:r>
-      <w:r>
-        <w:rPr>
-          <w:sz w:val="24"/>
-          <w:szCs w:val="24"/>
-          <w:shd w:val="clear" w:color="auto" w:fill="FFFFFF"/>
-        </w:rPr>
-        <w:t>преподаватель ГБПОУ «1-й МОК»</w:t>
-      </w:r>
-      <w:r>
-        <w:rPr>
-          <w:sz w:val="24"/>
-          <w:szCs w:val="24"/>
-          <w:shd w:val="clear" w:color="auto" w:fill="FFFFFF"/>
-        </w:rPr>
-        <w:t xml:space="preserve">, </w:t>
-      </w:r>
-    </w:p>
-    <w:p>
-      <w:pPr>
-        <w:rPr>
-          <w:sz w:val="24"/>
-          <w:szCs w:val="24"/>
-        </w:rPr>
-      </w:pPr>
-      <w:proofErr w:type="spellStart"/>
-      <w:r>
-        <w:rPr>
-          <w:sz w:val="24"/>
-          <w:szCs w:val="24"/>
-        </w:rPr>
-        <w:t>Фирстов</w:t>
-      </w:r>
-      <w:proofErr w:type="spellEnd"/>
-      <w:r>
-        <w:rPr>
-          <w:sz w:val="24"/>
-          <w:szCs w:val="24"/>
-        </w:rPr>
-        <w:t xml:space="preserve"> П</w:t>
-      </w:r>
-      <w:r>
-        <w:rPr>
-          <w:sz w:val="24"/>
-          <w:szCs w:val="24"/>
-        </w:rPr>
-        <w:t>.</w:t>
-      </w:r>
-      <w:r>
-        <w:rPr>
-          <w:sz w:val="24"/>
-          <w:szCs w:val="24"/>
-        </w:rPr>
-        <w:t>В</w:t>
-      </w:r>
-      <w:r>
-        <w:rPr>
-          <w:sz w:val="24"/>
-          <w:szCs w:val="24"/>
-        </w:rPr>
-        <w:t>.</w:t>
-      </w:r>
-      <w:r>
-        <w:rPr>
-          <w:sz w:val="24"/>
-          <w:szCs w:val="24"/>
-        </w:rPr>
-        <w:t xml:space="preserve"> - </w:t>
-      </w:r>
-      <w:r>
-        <w:rPr>
-          <w:sz w:val="24"/>
-          <w:szCs w:val="24"/>
-        </w:rPr>
-        <w:t>главный эксперт</w:t>
-      </w:r>
-      <w:r>
-        <w:rPr>
-          <w:sz w:val="24"/>
-          <w:szCs w:val="24"/>
-        </w:rPr>
-        <w:t xml:space="preserve"> ДЭ, </w:t>
-      </w:r>
-      <w:r>
-        <w:rPr>
-          <w:sz w:val="24"/>
-          <w:szCs w:val="24"/>
-        </w:rPr>
-        <w:t xml:space="preserve">преподаватель ГБПОУ </w:t>
-      </w:r>
-      <w:r>
-        <w:rPr>
-          <w:sz w:val="24"/>
-          <w:szCs w:val="24"/>
-        </w:rPr>
-        <w:t>КАИТ</w:t>
-      </w:r>
-      <w:r>
-        <w:rPr>
-          <w:sz w:val="24"/>
-          <w:szCs w:val="24"/>
-        </w:rPr>
-        <w:t xml:space="preserve"> №20</w:t>
-      </w:r>
-      <w:r>
-        <w:rPr>
-          <w:sz w:val="24"/>
-          <w:szCs w:val="24"/>
-        </w:rPr>
-        <w:t>,</w:t>
-      </w:r>
-    </w:p>
-    <w:p>
-      <w:pPr>
-        <w:rPr>
-          <w:sz w:val="24"/>
-          <w:szCs w:val="24"/>
-        </w:rPr>
-      </w:pPr>
-      <w:proofErr w:type="spellStart"/>
-      <w:r>
-        <w:rPr>
-          <w:sz w:val="24"/>
-          <w:szCs w:val="24"/>
-        </w:rPr>
-        <w:t>Фирстова</w:t>
-      </w:r>
-      <w:proofErr w:type="spellEnd"/>
-      <w:r>
-        <w:rPr>
-          <w:sz w:val="24"/>
-          <w:szCs w:val="24"/>
-        </w:rPr>
-        <w:t xml:space="preserve"> А.А.</w:t>
-      </w:r>
-      <w:r>
-        <w:rPr>
-          <w:rFonts w:eastAsia="Times New Roman"/>
-          <w:sz w:val="24"/>
-          <w:szCs w:val="24"/>
-          <w:lang w:eastAsia="ru-RU"/>
-        </w:rPr>
-        <w:t xml:space="preserve"> </w:t>
-      </w:r>
-      <w:r>
-        <w:rPr>
-          <w:rFonts w:eastAsia="Times New Roman"/>
-          <w:sz w:val="24"/>
-          <w:szCs w:val="24"/>
-          <w:lang w:eastAsia="ru-RU"/>
-        </w:rPr>
-        <w:t xml:space="preserve">- </w:t>
-      </w:r>
-      <w:r>
-        <w:rPr>
-          <w:sz w:val="24"/>
-          <w:szCs w:val="24"/>
-        </w:rPr>
-        <w:t>член экспертной группы ДЭ,</w:t>
-      </w:r>
-      <w:r>
-        <w:rPr>
-          <w:sz w:val="24"/>
-          <w:szCs w:val="24"/>
-        </w:rPr>
-        <w:t xml:space="preserve"> учитель ГБОУ «Школа №199»</w:t>
-      </w:r>
-      <w:r>
-        <w:rPr>
-          <w:sz w:val="24"/>
-          <w:szCs w:val="24"/>
-        </w:rPr>
-        <w:t>,</w:t>
-      </w:r>
-    </w:p>
-    <w:p>
-      <w:pPr>
-        <w:rPr>
-          <w:sz w:val="24"/>
-          <w:szCs w:val="24"/>
-        </w:rPr>
-      </w:pPr>
-      <w:proofErr w:type="spellStart"/>
-      <w:r>
-        <w:rPr>
-          <w:sz w:val="24"/>
-          <w:szCs w:val="24"/>
-        </w:rPr>
-        <w:t>Пацкевич</w:t>
-      </w:r>
-      <w:proofErr w:type="spellEnd"/>
-      <w:r>
-        <w:rPr>
-          <w:sz w:val="24"/>
-          <w:szCs w:val="24"/>
-        </w:rPr>
-        <w:t xml:space="preserve"> М.Ю.</w:t>
-      </w:r>
-      <w:r>
-        <w:rPr>
-          <w:rFonts w:eastAsia="Times New Roman"/>
-          <w:sz w:val="24"/>
-          <w:szCs w:val="24"/>
-          <w:lang w:eastAsia="ru-RU"/>
-        </w:rPr>
-        <w:t xml:space="preserve"> </w:t>
-      </w:r>
-      <w:r>
-        <w:rPr>
-          <w:rFonts w:eastAsia="Times New Roman"/>
-          <w:sz w:val="24"/>
-          <w:szCs w:val="24"/>
-          <w:lang w:eastAsia="ru-RU"/>
-        </w:rPr>
-        <w:t xml:space="preserve">- </w:t>
-      </w:r>
-      <w:r>
-        <w:rPr>
-          <w:sz w:val="24"/>
-          <w:szCs w:val="24"/>
-        </w:rPr>
-        <w:t>член экспертной группы ДЭ, преподаватель ГАПОУ КП №11,</w:t>
-      </w:r>
-    </w:p>
-    <w:p>
-      <w:pPr>
-        <w:rPr>
-          <w:sz w:val="24"/>
-          <w:szCs w:val="24"/>
-        </w:rPr>
-      </w:pPr>
-      <w:proofErr w:type="spellStart"/>
-      <w:r>
-        <w:rPr>
-          <w:sz w:val="24"/>
-          <w:szCs w:val="24"/>
-        </w:rPr>
-        <w:t>Наговицкий</w:t>
-      </w:r>
-      <w:proofErr w:type="spellEnd"/>
-      <w:r>
-        <w:rPr>
-          <w:sz w:val="24"/>
-          <w:szCs w:val="24"/>
-        </w:rPr>
-        <w:t xml:space="preserve"> А.А.</w:t>
-      </w:r>
-      <w:r>
-        <w:rPr>
-          <w:rFonts w:eastAsia="Times New Roman"/>
-          <w:sz w:val="24"/>
-          <w:szCs w:val="24"/>
-          <w:lang w:eastAsia="ru-RU"/>
-        </w:rPr>
-        <w:t xml:space="preserve"> </w:t>
-      </w:r>
-      <w:r>
-        <w:rPr>
-          <w:rFonts w:eastAsia="Times New Roman"/>
-          <w:sz w:val="24"/>
-          <w:szCs w:val="24"/>
-          <w:lang w:eastAsia="ru-RU"/>
-        </w:rPr>
-        <w:t xml:space="preserve">- </w:t>
-      </w:r>
-      <w:r>
-        <w:rPr>
-          <w:sz w:val="24"/>
-          <w:szCs w:val="24"/>
-        </w:rPr>
-        <w:t>член экспертной группы ДЭ, преподаватель ГАПОУ ТК №24,</w:t>
-      </w:r>
-    </w:p>
-    <w:p>
-      <w:pPr>
-        <w:rPr>
-          <w:sz w:val="24"/>
-          <w:szCs w:val="24"/>
-        </w:rPr>
-      </w:pPr>
-      <w:proofErr w:type="spellStart"/>
-      <w:r>
-        <w:rPr>
-          <w:sz w:val="24"/>
-          <w:szCs w:val="24"/>
-        </w:rPr>
-        <w:t>Гадецкая</w:t>
-      </w:r>
-      <w:proofErr w:type="spellEnd"/>
-      <w:r>
-        <w:rPr>
-          <w:sz w:val="24"/>
-          <w:szCs w:val="24"/>
-        </w:rPr>
-        <w:t xml:space="preserve"> Е.Г.</w:t>
-      </w:r>
-      <w:r>
-        <w:rPr>
-          <w:rFonts w:eastAsia="Times New Roman"/>
-          <w:sz w:val="24"/>
-          <w:szCs w:val="24"/>
-          <w:lang w:eastAsia="ru-RU"/>
-        </w:rPr>
-        <w:t xml:space="preserve"> </w:t>
-      </w:r>
-      <w:r>
-        <w:rPr>
-          <w:rFonts w:eastAsia="Times New Roman"/>
-          <w:sz w:val="24"/>
-          <w:szCs w:val="24"/>
-          <w:lang w:eastAsia="ru-RU"/>
-        </w:rPr>
-        <w:t xml:space="preserve">- </w:t>
-      </w:r>
-      <w:r>
-        <w:rPr>
-          <w:sz w:val="24"/>
-          <w:szCs w:val="24"/>
-        </w:rPr>
-        <w:t>член экспертной группы ДЭ, преподаватель ГБПОУ «МКАГ».</w:t>
+        <w:t>{ЧленыГЭК}</w:t>
       </w:r>
     </w:p>
     <w:p>
@@ -2926,7 +2365,7 @@
           <w:sz w:val="24"/>
           <w:szCs w:val="24"/>
         </w:rPr>
-        <w:t>Алха</w:t>
+        <w:t>{ПредседательГЭК_имя}</w:t>
       </w:r>
       <w:r>
         <w:rPr>
@@ -2934,7 +2373,6 @@
           <w:sz w:val="24"/>
           <w:szCs w:val="24"/>
         </w:rPr>
-        <w:t>с</w:t>
       </w:r>
       <w:r>
         <w:rPr>
@@ -2942,7 +2380,6 @@
           <w:sz w:val="24"/>
           <w:szCs w:val="24"/>
         </w:rPr>
-        <w:t>ова</w:t>
       </w:r>
       <w:proofErr w:type="spellEnd"/>
       <w:r>
@@ -2951,7 +2388,6 @@
           <w:sz w:val="24"/>
           <w:szCs w:val="24"/>
         </w:rPr>
-        <w:t xml:space="preserve"> Р.З.</w:t>
       </w:r>
     </w:p>
     <w:p>
@@ -2995,7 +2431,7 @@
           <w:sz w:val="24"/>
           <w:szCs w:val="24"/>
         </w:rPr>
-        <w:t>Суворкина Л.Э.</w:t>
+        <w:t>{СекретарьГЭК_имя}</w:t>
       </w:r>
     </w:p>
     <w:p>

</xml_diff>

<commit_message>
Populate protocol from DB: capture schedule №Протокол, replace hardcoded reviewer/grades with placeholders, add exam grade inputs
- loaders.py: detect unnamed column after «Дипломный руководитель» in schedule sheets and treat it as «Протокол» (fixes #57 missing)
- v1 template (data/протоколШАБЛОн.docx): replace hardcoded Батенина, Суворкина, 58 страниц, exam scores, ГИА grade with placeholders {Рецензент}, {Руководитель_исходный}, {ВКР}, {ГрафЧасть}, {БаллДемо}, {оценкаДемо}, {оценкаДиплом}, {ГИА}, {Дата_ДЭ}; remove duplicated paragraphs
- diploma.py / store.py: persist extra text fields (БаллДемо, оценкаДемо, оценкаДиплом, ГИА, Дата_ДЭ) as overrides
- diplomas.html / diploma.js: editable inputs for exam scores and ДЭ date
- data files: refresh with user-provided ДП/Защита versions

Co-Authored-By: Devin AI <158243242+devin-ai-integration[bot]@users.noreply.github.com>
</commit_message>
<xml_diff>
--- a/Form2Act-master/data/протоколШАБЛОн.docx
+++ b/Form2Act-master/data/протоколШАБЛОн.docx
@@ -212,7 +212,7 @@
           <w:sz w:val="28"/>
           <w:szCs w:val="28"/>
         </w:rPr>
-        <w:t>Дата ДЭ 23.06.2025 - 24.06.2025 Время с 09.00 до 14.05</w:t>
+        <w:t>Дата ДЭ {Дата_ДЭ} Время с 09.00 до 14.05</w:t>
       </w:r>
       <w:r>
         <w:rPr>
@@ -609,21 +609,19 @@
           <w:sz w:val="24"/>
           <w:szCs w:val="24"/>
         </w:rPr>
-        <w:t xml:space="preserve">ВКР выполнена под руководством преподавателя </w:t>
+        <w:t>ВКР выполнена под руководством преподавателя ГБПОУ «1-й МОК» {Руководитель_исходный}</w:t>
       </w:r>
       <w:r>
         <w:rPr>
           <w:sz w:val="22"/>
           <w:szCs w:val="22"/>
         </w:rPr>
-        <w:t>ГБПОУ «1-й МОК»</w:t>
-      </w:r>
-      <w:r>
-        <w:rPr>
-          <w:sz w:val="24"/>
-          <w:szCs w:val="24"/>
-        </w:rPr>
-        <w:t xml:space="preserve"> </w:t>
+      </w:r>
+      <w:r>
+        <w:rPr>
+          <w:sz w:val="24"/>
+          <w:szCs w:val="24"/>
+        </w:rPr>
       </w:r>
       <w:r>
         <w:rPr>
@@ -634,7 +632,6 @@
           <w:szCs w:val="24"/>
           <w:shd w:val="clear" w:color="auto" w:fill="FFFFFF"/>
         </w:rPr>
-        <w:fldChar w:fldCharType="begin"/>
       </w:r>
       <w:r>
         <w:rPr>
@@ -645,7 +642,6 @@
           <w:szCs w:val="24"/>
           <w:shd w:val="clear" w:color="auto" w:fill="FFFFFF"/>
         </w:rPr>
-        <w:instrText xml:space="preserve"> MERGEFIELD Руководитель </w:instrText>
       </w:r>
       <w:r>
         <w:rPr>
@@ -656,7 +652,6 @@
           <w:szCs w:val="24"/>
           <w:shd w:val="clear" w:color="auto" w:fill="FFFFFF"/>
         </w:rPr>
-        <w:fldChar w:fldCharType="separate"/>
       </w:r>
       <w:r>
         <w:rPr>
@@ -668,7 +663,6 @@
           <w:szCs w:val="24"/>
           <w:shd w:val="clear" w:color="auto" w:fill="FFFFFF"/>
         </w:rPr>
-        <w:t>Суворкиной Л. Э.</w:t>
       </w:r>
       <w:r>
         <w:rPr>
@@ -679,7 +673,6 @@
           <w:szCs w:val="24"/>
           <w:shd w:val="clear" w:color="auto" w:fill="FFFFFF"/>
         </w:rPr>
-        <w:fldChar w:fldCharType="end"/>
       </w:r>
       <w:r>
         <w:rPr>
@@ -687,7 +680,6 @@
           <w:sz w:val="23"/>
           <w:szCs w:val="23"/>
         </w:rPr>
-        <w:t xml:space="preserve"> </w:t>
       </w:r>
     </w:p>
     <w:p>
@@ -996,28 +988,25 @@
           <w:sz w:val="24"/>
           <w:szCs w:val="24"/>
         </w:rPr>
-        <w:t xml:space="preserve">ВКР </w:t>
-      </w:r>
-      <w:r>
-        <w:rPr>
-          <w:sz w:val="24"/>
-          <w:szCs w:val="24"/>
-        </w:rPr>
-        <w:fldChar w:fldCharType="begin"/>
-      </w:r>
-      <w:r>
-        <w:rPr>
-          <w:sz w:val="24"/>
-          <w:szCs w:val="24"/>
-        </w:rPr>
-        <w:instrText xml:space="preserve"> MERGEFIELD ВКР </w:instrText>
-      </w:r>
-      <w:r>
-        <w:rPr>
-          <w:sz w:val="24"/>
-          <w:szCs w:val="24"/>
-        </w:rPr>
-        <w:fldChar w:fldCharType="separate"/>
+        <w:t>ВКР {ВКР}.</w:t>
+      </w:r>
+      <w:r>
+        <w:rPr>
+          <w:sz w:val="24"/>
+          <w:szCs w:val="24"/>
+        </w:rPr>
+      </w:r>
+      <w:r>
+        <w:rPr>
+          <w:sz w:val="24"/>
+          <w:szCs w:val="24"/>
+        </w:rPr>
+      </w:r>
+      <w:r>
+        <w:rPr>
+          <w:sz w:val="24"/>
+          <w:szCs w:val="24"/>
+        </w:rPr>
       </w:r>
       <w:r>
         <w:rPr>
@@ -1025,7 +1014,6 @@
           <w:sz w:val="24"/>
           <w:szCs w:val="24"/>
         </w:rPr>
-        <w:t xml:space="preserve">на </w:t>
       </w:r>
       <w:bookmarkStart w:id="4" w:name="BKRstranic1"/>
       <w:r>
@@ -1034,7 +1022,6 @@
           <w:sz w:val="24"/>
           <w:szCs w:val="24"/>
         </w:rPr>
-        <w:t>58 страницах</w:t>
       </w:r>
       <w:bookmarkEnd w:id="4"/>
       <w:r>
@@ -1042,14 +1029,12 @@
           <w:sz w:val="24"/>
           <w:szCs w:val="24"/>
         </w:rPr>
-        <w:fldChar w:fldCharType="end"/>
-      </w:r>
-      <w:r>
-        <w:rPr>
-          <w:sz w:val="24"/>
-          <w:szCs w:val="24"/>
-        </w:rPr>
-        <w:t>.</w:t>
+      </w:r>
+      <w:r>
+        <w:rPr>
+          <w:sz w:val="24"/>
+          <w:szCs w:val="24"/>
+        </w:rPr>
       </w:r>
     </w:p>
     <w:p>
@@ -1070,7 +1055,7 @@
           <w:sz w:val="24"/>
           <w:szCs w:val="24"/>
         </w:rPr>
-        <w:t>Графические работы на {ГрафЧасть} страницах.</w:t>
+        <w:t>Графические работы {ГрафЧасть}.</w:t>
       </w:r>
       <w:r>
         <w:rPr>
@@ -1396,7 +1381,7 @@
           <w:sz w:val="24"/>
           <w:szCs w:val="24"/>
         </w:rPr>
-        <w:t>Рецензия: рецензент ИП Батенина София Ивановна. {Рецензия_замечания}, предложение расширить функционал. Результаты работы после незначительной доработки могут быть использованы в работе. Достоинства дипломной работы - полнота выполнения всех этапов разработки подсистемы, а также качество реализации программного кода.</w:t>
+        <w:t>Рецензия: рецензент {Рецензент}. {Рецензия_замечания}. Достоинства дипломной работы: {Рецензия_достоинства}.</w:t>
       </w:r>
       <w:r>
         <w:rPr>
@@ -1661,108 +1646,6 @@
       </w:r>
     </w:p>
     <w:bookmarkEnd w:id="12"/>
-    <w:p>
-      <w:pPr>
-        <w:pStyle w:val="60"/>
-        <w:shd w:val="clear" w:color="auto" w:fill="auto"/>
-        <w:tabs>
-          <w:tab w:val="left" w:pos="966"/>
-        </w:tabs>
-        <w:spacing w:line="240" w:lineRule="auto"/>
-        <w:ind w:firstLine="709"/>
-        <w:jc w:val="both"/>
-        <w:rPr>
-          <w:bCs/>
-          <w:i w:val="0"/>
-          <w:color w:val="auto"/>
-          <w:sz w:val="24"/>
-          <w:szCs w:val="24"/>
-        </w:rPr>
-      </w:pPr>
-      <w:r>
-        <w:rPr>
-          <w:bCs/>
-          <w:i w:val="0"/>
-          <w:color w:val="auto"/>
-          <w:sz w:val="24"/>
-          <w:szCs w:val="24"/>
-        </w:rPr>
-        <w:t>Обучающийся</w:t>
-      </w:r>
-      <w:r>
-        <w:rPr>
-          <w:bCs/>
-          <w:i w:val="0"/>
-          <w:color w:val="auto"/>
-          <w:sz w:val="24"/>
-          <w:szCs w:val="24"/>
-        </w:rPr>
-        <w:t xml:space="preserve"> </w:t>
-      </w:r>
-      <w:r>
-        <w:rPr>
-          <w:bCs/>
-          <w:i w:val="0"/>
-          <w:color w:val="auto"/>
-          <w:sz w:val="24"/>
-          <w:szCs w:val="24"/>
-        </w:rPr>
-        <w:t xml:space="preserve">продемонстрировал </w:t>
-      </w:r>
-      <w:bookmarkStart w:id="13" w:name="znaniya1"/>
-      <w:r>
-        <w:rPr>
-          <w:bCs/>
-          <w:i w:val="0"/>
-          <w:color w:val="auto"/>
-          <w:sz w:val="24"/>
-          <w:szCs w:val="24"/>
-        </w:rPr>
-        <w:t>хороший уровень знаний</w:t>
-      </w:r>
-      <w:bookmarkEnd w:id="13"/>
-      <w:r>
-        <w:rPr>
-          <w:bCs/>
-          <w:i w:val="0"/>
-          <w:color w:val="auto"/>
-          <w:sz w:val="24"/>
-          <w:szCs w:val="24"/>
-        </w:rPr>
-        <w:t xml:space="preserve"> и профессиональных </w:t>
-      </w:r>
-      <w:r>
-        <w:rPr>
-          <w:bCs/>
-          <w:i w:val="0"/>
-          <w:color w:val="auto"/>
-          <w:sz w:val="24"/>
-          <w:szCs w:val="24"/>
-        </w:rPr>
-        <w:lastRenderedPageBreak/>
-        <w:t>компетенции, а также практических навыков в решении конкретных профессиональных задач</w:t>
-      </w:r>
-      <w:r>
-        <w:rPr>
-          <w:bCs/>
-          <w:i w:val="0"/>
-          <w:color w:val="auto"/>
-          <w:sz w:val="24"/>
-          <w:szCs w:val="24"/>
-        </w:rPr>
-        <w:t xml:space="preserve">. </w:t>
-      </w:r>
-      <w:bookmarkStart w:id="14" w:name="zashita3"/>
-      <w:r>
-        <w:rPr>
-          <w:i w:val="0"/>
-          <w:sz w:val="24"/>
-          <w:szCs w:val="24"/>
-        </w:rPr>
-        <w:t xml:space="preserve">При защите работы обучающийся показал знание вопросов темы, оперировал данными исследования, без особых затруднений отвечал на поставленные вопросы </w:t>
-      </w:r>
-      <w:bookmarkEnd w:id="14"/>
-    </w:p>
     <w:p>
       <w:pPr>
         <w:ind w:firstLine="0"/>
@@ -1812,7 +1695,7 @@
           <w:sz w:val="24"/>
           <w:szCs w:val="24"/>
         </w:rPr>
-        <w:t>1.1 Выполнил задание демонстрационного экзамена профильного уровня на 45 баллов, что соответствует оценке 4 (хорошо)</w:t>
+        <w:t>1.1 Выполнил задание демонстрационного экзамена профильного уровня на {БаллДемо} баллов, что соответствует оценке {оценкаДемо}</w:t>
       </w:r>
       <w:r>
         <w:rPr>
@@ -1934,7 +1817,7 @@
           <w:sz w:val="24"/>
           <w:szCs w:val="24"/>
         </w:rPr>
-        <w:t>1.2 Защитил дипломную работу/проект на оценку 3 (удовлетворительно)</w:t>
+        <w:t>1.2 Защитил дипломную работу/проект на оценку {оценкаДиплом}</w:t>
       </w:r>
       <w:r>
         <w:rPr>
@@ -2112,7 +1995,7 @@
           <w:sz w:val="24"/>
           <w:szCs w:val="24"/>
         </w:rPr>
-        <w:t>1.3. Определить результаты ГИА оценкой 4 (хорошо).</w:t>
+        <w:t>1.3. Определить результаты ГИА оценкой {ГИА}.</w:t>
       </w:r>
       <w:r>
         <w:rPr>
@@ -2276,48 +2159,6 @@
           <w:sz w:val="24"/>
           <w:szCs w:val="24"/>
         </w:rPr>
-      </w:r>
-    </w:p>
-    <w:p>
-      <w:pPr>
-        <w:pStyle w:val="aa"/>
-        <w:numPr>
-          <w:ilvl w:val="0"/>
-          <w:numId w:val="2"/>
-        </w:numPr>
-        <w:rPr>
-          <w:color w:val="auto"/>
-          <w:sz w:val="24"/>
-          <w:szCs w:val="24"/>
-        </w:rPr>
-      </w:pPr>
-      <w:r>
-        <w:rPr>
-          <w:color w:val="auto"/>
-          <w:sz w:val="24"/>
-          <w:szCs w:val="24"/>
-        </w:rPr>
-        <w:t>Присвоить квал</w:t>
-      </w:r>
-      <w:bookmarkStart w:id="20" w:name="_GoBack"/>
-      <w:bookmarkEnd w:id="20"/>
-      <w:r>
-        <w:rPr>
-          <w:color w:val="auto"/>
-          <w:sz w:val="24"/>
-          <w:szCs w:val="24"/>
-        </w:rPr>
-        <w:t xml:space="preserve">ификацию </w:t>
-      </w:r>
-      <w:r>
-        <w:rPr>
-          <w:b/>
-          <w:bCs/>
-          <w:color w:val="auto"/>
-          <w:sz w:val="24"/>
-          <w:szCs w:val="24"/>
-        </w:rPr>
-        <w:t>Специалист по информационным системам.</w:t>
       </w:r>
     </w:p>
     <w:p>

</xml_diff>